<commit_message>
Update current internship, portfolio domain, and editable text catalog
</commit_message>
<xml_diff>
--- a/assets/Colt Melton Resume - Anduril.docx
+++ b/assets/Colt Melton Resume - Anduril.docx
@@ -179,6 +179,19 @@
     </w:p>
     <w:p>
       <w:pPr>
+        <w:widowControl/>
+        <w:spacing w:after="0"/>
+      </w:pPr>
+      <w:r>
+        <w:rPr>
+          <w:rFonts w:ascii="Arial" w:hAnsi="Arial"/>
+          <w:sz w:val="17"/>
+        </w:rPr>
+        <w:t xml:space="preserve">Enterprise Software: SAP, ERP audit support, Linux scripting, SQL queries, data aggregation</w:t>
+      </w:r>
+    </w:p>
+    <w:p>
+      <w:pPr>
         <w:keepNext/>
         <w:spacing w:before="60" w:after="20"/>
         <w:widowControl/>
@@ -210,7 +223,7 @@
           <w:b/>
           <w:sz w:val="19"/>
         </w:rPr>
-        <w:t>Research &amp; Development Engineer / Scientist Intern</w:t>
+        <w:t xml:space="preserve">CSI Intern</w:t>
       </w:r>
       <w:r>
         <w:tab/>
@@ -219,7 +232,92 @@
         <w:rPr>
           <w:sz w:val="18"/>
         </w:rPr>
-        <w:t>October 2025 – Present</w:t>
+        <w:t xml:space="preserve">October 6, 2026 – Present</w:t>
+      </w:r>
+    </w:p>
+    <w:p>
+      <w:pPr>
+        <w:keepNext/>
+        <w:widowControl/>
+        <w:spacing w:after="0"/>
+      </w:pPr>
+      <w:r>
+        <w:rPr>
+          <w:rFonts w:ascii="Arial" w:hAnsi="Arial"/>
+          <w:sz w:val="17"/>
+        </w:rPr>
+        <w:t xml:space="preserve">Central Garden &amp; Pet</w:t>
+      </w:r>
+    </w:p>
+    <w:p>
+      <w:pPr>
+        <w:keepLines/>
+        <w:widowControl/>
+        <w:spacing w:after="10"/>
+        <w:ind w:left="187" w:hanging="187"/>
+      </w:pPr>
+      <w:r>
+        <w:rPr>
+          <w:rFonts w:ascii="Arial" w:hAnsi="Arial"/>
+          <w:sz w:val="17"/>
+        </w:rPr>
+        <w:t xml:space="preserve">• Support audit-related corporate software work in SAP and enterprise resource planning systems.</w:t>
+      </w:r>
+    </w:p>
+    <w:p>
+      <w:pPr>
+        <w:keepLines/>
+        <w:widowControl/>
+        <w:spacing w:after="10"/>
+        <w:ind w:left="187" w:hanging="187"/>
+      </w:pPr>
+      <w:r>
+        <w:rPr>
+          <w:rFonts w:ascii="Arial" w:hAnsi="Arial"/>
+          <w:sz w:val="17"/>
+        </w:rPr>
+        <w:t xml:space="preserve">• Write scripts and automate Linux workflows to support corporate software operations and audit tasks.</w:t>
+      </w:r>
+    </w:p>
+    <w:p>
+      <w:pPr>
+        <w:keepLines/>
+        <w:widowControl/>
+        <w:spacing w:after="10"/>
+        <w:ind w:left="187" w:hanging="187"/>
+      </w:pPr>
+      <w:r>
+        <w:rPr>
+          <w:rFonts w:ascii="Arial" w:hAnsi="Arial"/>
+          <w:sz w:val="17"/>
+        </w:rPr>
+        <w:t xml:space="preserve">• Develop SQL queries and data aggregation software to organize and summarize information for audit-related work.</w:t>
+      </w:r>
+    </w:p>
+    <w:p>
+      <w:pPr>
+        <w:keepNext/>
+        <w:widowControl/>
+        <w:tabs>
+          <w:tab w:pos="10728" w:val="right"/>
+        </w:tabs>
+        <w:spacing w:before="30" w:after="0"/>
+      </w:pPr>
+      <w:r>
+        <w:rPr>
+          <w:b/>
+          <w:sz w:val="19"/>
+        </w:rPr>
+        <w:t xml:space="preserve">Research &amp; Development Engineer / Scientist Intern</w:t>
+      </w:r>
+      <w:r>
+        <w:tab/>
+      </w:r>
+      <w:r>
+        <w:rPr>
+          <w:sz w:val="18"/>
+        </w:rPr>
+        <w:t xml:space="preserve">October 2025 – October 6, 2026</w:t>
       </w:r>
     </w:p>
     <w:p>
@@ -944,7 +1042,7 @@
         <w:rFonts w:ascii="Arial" w:hAnsi="Arial"/>
         <w:sz w:val="16"/>
       </w:rPr>
-      <w:t>Kimball, MI  •  coltmeltonwork@gmail.com  •  linkedin.com/in/coltmelton  •  github.com/coltmelton  •  coltmelton.netlify.app</w:t>
+      <w:t>Kimball, MI  •  coltmeltonwork@gmail.com  •  linkedin.com/in/coltmelton  •  github.com/coltmelton  •  coltmelton.dev</w:t>
     </w:r>
   </w:p>
 </w:hdr>

</xml_diff>